<commit_message>
docs: regenerate hadiths_jour.docx (hadiths 2,8,14,41,47,72,136,142,175) + contexte dans export
Co-Authored-By: Claude Opus 4.6 (1M context) <noreply@anthropic.com>
</commit_message>
<xml_diff>
--- a/ECRITS_NIYYAH/hadiths_jour.docx
+++ b/ECRITS_NIYYAH/hadiths_jour.docx
@@ -108,7 +108,7 @@
           <w:sz w:val="22"/>
           <w:szCs w:val="22"/>
         </w:rPr>
-        <w:t xml:space="preserve">الْإِسْلَامُ أَنْ تَشْهَدَ أَنْ لَا إِلَهَ إِلَّا اللَّهُ</w:t>
+        <w:t xml:space="preserve">الْإِسْلَامُ أَنْ تَشْهَدَ أَنْ لَا إِلَهَ إِلَّا اللَّهُ وَأَنَّ مُحَمَّدًا رَسُولُ اللَّهِ، وَتُقِيمَ الصَّلَاةَ، وَتُؤْتِيَ الزَّكَاةَ، وَتَصُومَ رَمَضَانَ، وَتَحُجَّ الْبَيْتَ إِنِ اسْتَطَعْتَ إِلَيْهِ سَبِيلًا</w:t>
       </w:r>
     </w:p>
     <w:p>
@@ -516,6 +516,19 @@
     </w:p>
     <w:p>
       <w:pPr>
+        <w:spacing w:after="60"/>
+      </w:pPr>
+      <w:r>
+        <w:rPr>
+          <w:rFonts w:ascii="Cormorant Garamond" w:cs="Cormorant Garamond" w:eastAsia="Cormorant Garamond" w:hAnsi="Cormorant Garamond"/>
+          <w:sz w:val="22"/>
+          <w:szCs w:val="22"/>
+        </w:rPr>
+        <w:t xml:space="preserve">[Contexte] Hadith révélé dans le contexte des guerres défensives de Médine contre les coalitions qui voulaient anéantir la communauté musulmane naissante. Les savants classiques (Ibn Taymiyya, An-Nawawi lui-même) ont précisé que ‘les gens’ désigne ici les belligérants polythéistes attaquant l’islam, non l’humanité entière. Le verset coranique ‘Pas de contrainte en religion’ (2:256) reste la règle générale.</w:t>
+      </w:r>
+    </w:p>
+    <w:p>
+      <w:pPr>
         <w:pBdr>
           <w:bottom w:val="single" w:color="CCCCCC" w:sz="1"/>
         </w:pBdr>
@@ -906,6 +919,19 @@
     </w:p>
     <w:p>
       <w:pPr>
+        <w:spacing w:after="60"/>
+      </w:pPr>
+      <w:r>
+        <w:rPr>
+          <w:rFonts w:ascii="Cormorant Garamond" w:cs="Cormorant Garamond" w:eastAsia="Cormorant Garamond" w:hAnsi="Cormorant Garamond"/>
+          <w:sz w:val="22"/>
+          <w:szCs w:val="22"/>
+        </w:rPr>
+        <w:t xml:space="preserve">[Contexte] Hadith juridique classique encadrant la peine capitale dans un cadre étatique islamique historique avec procédures, témoins, et tribunal. Aucune de ces sanctions n’est applicable individuellement : seule une autorité judiciaire compétente peut les prononcer, et toujours après procès. Dans les sociétés contemporaines, les musulmans sont tenus de respecter les lois civiles du pays où ils résident.</w:t>
+      </w:r>
+    </w:p>
+    <w:p>
+      <w:pPr>
         <w:pBdr>
           <w:bottom w:val="single" w:color="CCCCCC" w:sz="1"/>
         </w:pBdr>
@@ -2643,7 +2669,7 @@
           <w:sz w:val="22"/>
           <w:szCs w:val="22"/>
         </w:rPr>
-        <w:t xml:space="preserve">ثَلَاثٌ مَنْ كُنَّ فِيهِ وَجَدَ حَلَاوَةَ الْإِيمَانِ</w:t>
+        <w:t xml:space="preserve">أَفْضَلُ الْإِيمَانِ أَنْ تَعْلَمَ أَنَّ اللَّهَ مَعَكَ حَيْثُمَا كُنْتَ</w:t>
       </w:r>
     </w:p>
     <w:p>
@@ -3020,33 +3046,33 @@
           <w:sz w:val="20"/>
           <w:szCs w:val="20"/>
         </w:rPr>
-        <w:t xml:space="preserve">Bukhari 52, Muslim 1599 — sahih</w:t>
-      </w:r>
-    </w:p>
-    <w:p>
-      <w:pPr>
-        <w:spacing w:after="60"/>
-      </w:pPr>
-      <w:r>
-        <w:rPr>
-          <w:rFonts w:ascii="Cormorant Garamond" w:cs="Cormorant Garamond" w:eastAsia="Cormorant Garamond" w:hAnsi="Cormorant Garamond"/>
-          <w:sz w:val="22"/>
-          <w:szCs w:val="22"/>
-        </w:rPr>
-        <w:t xml:space="preserve">أَلَا وَإِنَّ فِي الْجَسَدِ مُضْغَةً</w:t>
-      </w:r>
-    </w:p>
-    <w:p>
-      <w:pPr>
-        <w:spacing w:after="60"/>
-      </w:pPr>
-      <w:r>
-        <w:rPr>
-          <w:rFonts w:ascii="Cormorant Garamond" w:cs="Cormorant Garamond" w:eastAsia="Cormorant Garamond" w:hAnsi="Cormorant Garamond"/>
-          <w:sz w:val="22"/>
-          <w:szCs w:val="22"/>
-        </w:rPr>
-        <w:t xml:space="preserve">Il y a dans le corps un morceau de chair : s'il est bon, tout le corps est bon ; s'il est gâté, tout le corps est gâté. C'est le cœur.</w:t>
+        <w:t xml:space="preserve">Tirmidhi 2459 — hasan — hasan</w:t>
+      </w:r>
+    </w:p>
+    <w:p>
+      <w:pPr>
+        <w:spacing w:after="60"/>
+      </w:pPr>
+      <w:r>
+        <w:rPr>
+          <w:rFonts w:ascii="Cormorant Garamond" w:cs="Cormorant Garamond" w:eastAsia="Cormorant Garamond" w:hAnsi="Cormorant Garamond"/>
+          <w:sz w:val="22"/>
+          <w:szCs w:val="22"/>
+        </w:rPr>
+        <w:t xml:space="preserve">الْكَيِّسُ مَنْ دَانَ نَفْسَهُ وَعَمِلَ لِمَا بَعْدَ الْمَوْتِ</w:t>
+      </w:r>
+    </w:p>
+    <w:p>
+      <w:pPr>
+        <w:spacing w:after="60"/>
+      </w:pPr>
+      <w:r>
+        <w:rPr>
+          <w:rFonts w:ascii="Cormorant Garamond" w:cs="Cormorant Garamond" w:eastAsia="Cormorant Garamond" w:hAnsi="Cormorant Garamond"/>
+          <w:sz w:val="22"/>
+          <w:szCs w:val="22"/>
+        </w:rPr>
+        <w:t xml:space="preserve">L’homme avisé est celui qui se juge lui-même et œuvre pour ce qui suit la mort. L’incapable est celui qui suit ses passions et compte sur Allah sans agir.</w:t>
       </w:r>
     </w:p>
     <w:p>
@@ -4645,7 +4671,7 @@
           <w:sz w:val="20"/>
           <w:szCs w:val="20"/>
         </w:rPr>
-        <w:t xml:space="preserve">Muwatta Malik, Ahmad 8952 · Authentifié hasan par Al-Albani — sahih</w:t>
+        <w:t xml:space="preserve">Muwatta Malik, Ahmad 8952 · Authentifié sahih par Al-Albani — sahih</w:t>
       </w:r>
     </w:p>
     <w:p>
@@ -8805,7 +8831,7 @@
           <w:sz w:val="20"/>
           <w:szCs w:val="20"/>
         </w:rPr>
-        <w:t xml:space="preserve">Bukhari 2818, Muslim 1742 — sahih</w:t>
+        <w:t xml:space="preserve">Bukhari 2818, Muslim 1742 — sahih — sahih</w:t>
       </w:r>
     </w:p>
     <w:p>
@@ -8831,7 +8857,20 @@
           <w:sz w:val="22"/>
           <w:szCs w:val="22"/>
         </w:rPr>
-        <w:t xml:space="preserve">Le Paradis est sous l'ombre des sabres (récompense des combattants patients dans la voie d'Allah).</w:t>
+        <w:t xml:space="preserve">Le Paradis est sous l’ombre des sabres.</w:t>
+      </w:r>
+    </w:p>
+    <w:p>
+      <w:pPr>
+        <w:spacing w:after="60"/>
+      </w:pPr>
+      <w:r>
+        <w:rPr>
+          <w:rFonts w:ascii="Cormorant Garamond" w:cs="Cormorant Garamond" w:eastAsia="Cormorant Garamond" w:hAnsi="Cormorant Garamond"/>
+          <w:sz w:val="22"/>
+          <w:szCs w:val="22"/>
+        </w:rPr>
+        <w:t xml:space="preserve">[Contexte] Hadith prononcé avant la bataille défensive de Badr (an 2 de l’Hégire), où la communauté médinoise faisait face à une coalition mecquoise venue l’anéantir. Les savants l’interprètent comme la promesse du Paradis pour ceux qui défendent leur communauté avec patience et juste cause, dans un cadre étatique de guerre légitime. Il ne saurait justifier aucune violence individuelle ou hors du droit. Le verset coranique ‘Celui qui tue une âme... c’est comme s’il avait tué l’humanité entière’ (5:32) demeure la règle fondamentale.</w:t>
       </w:r>
     </w:p>
     <w:p>
@@ -11340,7 +11379,7 @@
           <w:sz w:val="20"/>
           <w:szCs w:val="20"/>
         </w:rPr>
-        <w:t xml:space="preserve">Tirmidhi 1919, Ahmad 7033 — hasan — sahih</w:t>
+        <w:t xml:space="preserve">Tirmidhi 1919, Ahmad 7033 — sahih — sahih</w:t>
       </w:r>
     </w:p>
     <w:p>

</xml_diff>

<commit_message>
regen ecrits hadiths apres corrections
Co-Authored-By: Claude Opus 4.6 (1M context) <noreply@anthropic.com>
</commit_message>
<xml_diff>
--- a/ECRITS_NIYYAH/hadiths_jour.docx
+++ b/ECRITS_NIYYAH/hadiths_jour.docx
@@ -4193,7 +4193,7 @@
           <w:sz w:val="22"/>
           <w:szCs w:val="22"/>
         </w:rPr>
-        <w:t xml:space="preserve">Tirmidhi 2699 / Authentifié par Al-Albani</w:t>
+        <w:t xml:space="preserve">Tabarânî (al-Awsat) · Authentifié hasan par Al-Albânî (Silsila Sahîha)</w:t>
       </w:r>
     </w:p>
     <w:p>
@@ -5029,7 +5029,7 @@
           <w:sz w:val="22"/>
           <w:szCs w:val="22"/>
         </w:rPr>
-        <w:t xml:space="preserve">Cité comme parole sage / attribué au Prophète ﷺ par Tabarani — authentifié hasan par Al-Albani</w:t>
+        <w:t xml:space="preserve">Parole de 'Ammâr ibn Yâsir (athar) — Ahmad (az-Zuhd), Ibn Abî ad-Dunyâ · Statut : athar, non hadith prophétique</w:t>
       </w:r>
     </w:p>
     <w:p>
@@ -5599,7 +5599,7 @@
           <w:sz w:val="22"/>
           <w:szCs w:val="22"/>
         </w:rPr>
-        <w:t xml:space="preserve">Tabarani / Authentifié par Al-Albani</w:t>
+        <w:t xml:space="preserve">Bayhaqî (Shu'ab al-Îmân 4929), Abû Ya'lâ · Authentifié hasan par Al-Albânî (Silsila Sahîha 1113)</w:t>
       </w:r>
     </w:p>
     <w:p>
@@ -5751,7 +5751,7 @@
           <w:sz w:val="22"/>
           <w:szCs w:val="22"/>
         </w:rPr>
-        <w:t xml:space="preserve">Parole sage attribuée — Tabarani, Sahih al-Jami' 4177, hasan selon Al-Albani</w:t>
+        <w:t xml:space="preserve">Maxime — attribution prophétique non confirmée (ne pas présenter comme hadith authentique)</w:t>
       </w:r>
     </w:p>
     <w:p>
@@ -6017,7 +6017,7 @@
           <w:sz w:val="22"/>
           <w:szCs w:val="22"/>
         </w:rPr>
-        <w:t xml:space="preserve">Ibn Majah 425, Ahmad 7065 · hasan</w:t>
+        <w:t xml:space="preserve">Ibn Majah 425, Ahmad 7065 · da'îf (gradation contestée)</w:t>
       </w:r>
     </w:p>
     <w:p>

</xml_diff>

<commit_message>
Corrections attribution/gradation hadiths (audit Mode 2) + regen Word
Co-Authored-By: Claude Opus 4.6 (1M context) <noreply@anthropic.com>
</commit_message>
<xml_diff>
--- a/ECRITS_NIYYAH/hadiths_jour.docx
+++ b/ECRITS_NIYYAH/hadiths_jour.docx
@@ -1153,7 +1153,7 @@
           <w:sz w:val="22"/>
           <w:szCs w:val="22"/>
         </w:rPr>
-        <w:t xml:space="preserve">Daraqutni · Hadith 30 An-Nawawi</w:t>
+        <w:t xml:space="preserve">An-Nawawî 40 (n°30), Ad-Dâraqutnî — hasan selon An-Nawawî (gradation discutée : chaîne jugée faible par plusieurs critiques).</w:t>
       </w:r>
     </w:p>
     <w:p>
@@ -1799,7 +1799,7 @@
           <w:sz w:val="22"/>
           <w:szCs w:val="22"/>
         </w:rPr>
-        <w:t xml:space="preserve">Tirmidhi 2459 — hasan</w:t>
+        <w:t xml:space="preserve">Tirmidhî 2459 — hasan selon Tirmidhî (gradation discutée : chaîne via Abû Bakr ibn Abî Maryam contestée). Via Shaddâd ibn Aws.</w:t>
       </w:r>
     </w:p>
     <w:p>
@@ -3547,7 +3547,7 @@
           <w:sz w:val="22"/>
           <w:szCs w:val="22"/>
         </w:rPr>
-        <w:t xml:space="preserve">Tirmidhi 2352, Ibn Majah 4126</w:t>
+        <w:t xml:space="preserve">Tirmidhî 2352, Ibn Mâja 4126 — da'îf (contesté). Le sens « humble devant Allah » reste valable.</w:t>
       </w:r>
     </w:p>
     <w:p>
@@ -4193,7 +4193,7 @@
           <w:sz w:val="22"/>
           <w:szCs w:val="22"/>
         </w:rPr>
-        <w:t xml:space="preserve">Tabarânî (al-Awsat) · Authentifié hasan par Al-Albânî (Silsila Sahîha)</w:t>
+        <w:t xml:space="preserve">At-Tabarânî (al-Awsat) — hasan (Al-Albânî, Silsila Sahîha). [Réf « Tirmidhî 2699 » erronée, corrigée.]</w:t>
       </w:r>
     </w:p>
     <w:p>
@@ -5029,7 +5029,7 @@
           <w:sz w:val="22"/>
           <w:szCs w:val="22"/>
         </w:rPr>
-        <w:t xml:space="preserve">Parole de 'Ammâr ibn Yâsir (athar) — Ahmad (az-Zuhd), Ibn Abî ad-Dunyâ · Statut : athar, non hadith prophétique</w:t>
+        <w:t xml:space="preserve">Parole de Compagnon (athar) — rapportée de 'Ammâr ibn Yâsir et d'Ibn Mas'ûd, sahîh en mawqûf (Ahmad, az-Zuhd ; Ibn Abî ad-Dunyâ, al-Yaqîn). La version attribuée au Prophète ﷺ est faible.</w:t>
       </w:r>
     </w:p>
     <w:p>
@@ -5599,7 +5599,7 @@
           <w:sz w:val="22"/>
           <w:szCs w:val="22"/>
         </w:rPr>
-        <w:t xml:space="preserve">Bayhaqî (Shu'ab al-Îmân 4929), Abû Ya'lâ · Authentifié hasan par Al-Albânî (Silsila Sahîha 1113)</w:t>
+        <w:t xml:space="preserve">Al-Bayhaqî (Shu'ab al-Îmân 4929), Abû Ya'lâ — hasan (Al-Albânî, Silsila Sahîha 1113).</w:t>
       </w:r>
     </w:p>
     <w:p>
@@ -5751,7 +5751,7 @@
           <w:sz w:val="22"/>
           <w:szCs w:val="22"/>
         </w:rPr>
-        <w:t xml:space="preserve">Maxime — attribution prophétique non confirmée (ne pas présenter comme hadith authentique)</w:t>
+        <w:t xml:space="preserve">Adage répandu — l'attribution au Prophète ﷺ n'est pas authentiquement établie.</w:t>
       </w:r>
     </w:p>
     <w:p>
@@ -6017,7 +6017,7 @@
           <w:sz w:val="22"/>
           <w:szCs w:val="22"/>
         </w:rPr>
-        <w:t xml:space="preserve">Ibn Majah 425, Ahmad 7065 · da'îf (gradation contestée)</w:t>
+        <w:t xml:space="preserve">Ibn Mâja 425, Ahmad — da'îf (gradation contestée).</w:t>
       </w:r>
     </w:p>
     <w:p>
@@ -6625,7 +6625,7 @@
           <w:sz w:val="22"/>
           <w:szCs w:val="22"/>
         </w:rPr>
-        <w:t xml:space="preserve">Tirmidhi 1952</w:t>
+        <w:t xml:space="preserve">Tirmidhî 1952 — da'îf (Tirmidhî, adh-Dhahabî, al-Albânî). Sens vertueux mais hadith non solide.</w:t>
       </w:r>
     </w:p>
     <w:p>

</xml_diff>